<commit_message>
Fill tables of contents and remove internal file references
</commit_message>
<xml_diff>
--- a/source/en/1-level-zero.docx
+++ b/source/en/1-level-zero.docx
@@ -195,10 +195,10 @@
           <w:i/>
           <w:iCs/>
         </w:rPr>
-        <w:t xml:space="preserve">Claude_Manual_Level_One_v2.1.docx</w:t>
-      </w:r>
-      <w:r>
-        <w:t xml:space="preserve"> in the same Manuals folder — takes you further: real prompting, Projects, connectors, a gentle step into Code and Git, and your first agent.</w:t>
+        <w:t xml:space="preserve">Level One</w:t>
+      </w:r>
+      <w:r>
+        <w:t xml:space="preserve">, also in this collection — takes you further: real prompting, Projects, connectors, a gentle step into Code and Git, and your first agent.</w:t>
       </w:r>
     </w:p>
     <w:p>
@@ -3212,7 +3212,7 @@
               <w:spacing w:after="100" w:line="262"/>
             </w:pPr>
             <w:r>
-              <w:t xml:space="preserve">It is not because something is written down that it is correct — that applies to notes, web pages, and anything Claude itself produces. Always check important claims against a reliable source or the Claude Manuals. This manual was fact-checked that way.</w:t>
+              <w:t xml:space="preserve">It is not because something is written down that it is correct — that applies to notes, web pages, and anything Claude itself produces. Always check important claims against a reliable source, such as Anthropic's official help pages. This manual was fact-checked that way.</w:t>
             </w:r>
           </w:p>
         </w:tc>
@@ -8223,7 +8223,7 @@
         <w:spacing w:after="100" w:line="262"/>
       </w:pPr>
       <w:r>
-        <w:t xml:space="preserve">If you prefer watching, these beginner-friendly videos (kept in the YouTube_Videos folder, with transcripts) are a good next step. They are in English, where the most information is.</w:t>
+        <w:t xml:space="preserve">If you prefer watching, these beginner-friendly videos (search for the titles on YouTube) are a good next step. They are in English, where the most information is.</w:t>
       </w:r>
     </w:p>
     <w:p>

</xml_diff>

<commit_message>
Beginner update: Start here guide, Level Zero 3.3, primer 1.3, new reading order
</commit_message>
<xml_diff>
--- a/source/en/1-level-zero.docx
+++ b/source/en/1-level-zero.docx
@@ -151,7 +151,7 @@
           <w:sz w:val="20"/>
           <w:szCs w:val="20"/>
         </w:rPr>
-        <w:t xml:space="preserve">Version 3.2 — August 2026</w:t>
+        <w:t xml:space="preserve">Version 3.3 — September 2026</w:t>
       </w:r>
     </w:p>
     <w:p>
@@ -178,6 +178,33 @@
       </w:pPr>
       <w:r>
         <w:t xml:space="preserve">This is the beginner book. It assumes you have never used Claude for real work and starts from absolute zero. Read it in order the first time, then keep it open as a reference.</w:t>
+      </w:r>
+    </w:p>
+    <w:p>
+      <w:pPr>
+        <w:keepLines/>
+        <w:widowControl/>
+        <w:spacing w:after="100" w:line="262"/>
+      </w:pPr>
+      <w:r>
+        <w:rPr>
+          <w:b/>
+          <w:bCs/>
+        </w:rPr>
+        <w:t xml:space="preserve">Never used an AI at all?</w:t>
+      </w:r>
+      <w:r>
+        <w:t xml:space="preserve"> Read the two-page </w:t>
+      </w:r>
+      <w:r>
+        <w:rPr>
+          <w:b/>
+          <w:bCs/>
+        </w:rPr>
+        <w:t xml:space="preserve">Start here</w:t>
+      </w:r>
+      <w:r>
+        <w:t xml:space="preserve"> guide first. It gets you a first result on the free plan in ten minutes.</w:t>
       </w:r>
     </w:p>
     <w:p>
@@ -422,7 +449,7 @@
                 <w:sz w:val="22"/>
                 <w:szCs w:val="22"/>
               </w:rPr>
-              <w:t xml:space="preserve">What is new in version 3.2</w:t>
+              <w:t xml:space="preserve">What is new in version 3.3</w:t>
             </w:r>
           </w:p>
           <w:p>
@@ -433,7 +460,7 @@
               <w:spacing w:after="100" w:line="262"/>
             </w:pPr>
             <w:r>
-              <w:t xml:space="preserve">Added: choosing a sign-in email you keep; importing your memory from another AI; "Record a skill" in Cowork; and Claude Design (covered in Level One). Updated: the new single app home and where Projects now live, plus a reminder that models and screens change quickly.</w:t>
+              <w:t xml:space="preserve">Added: a two-page "Start here" guide for complete beginners; a free-plan route in Chapter 1; a short explanation of each technical word where it first appears; a glossary grouped by theme. Updated: personal rules of thumb are now marked as experience, not fact.</w:t>
             </w:r>
           </w:p>
         </w:tc>
@@ -449,6 +476,7 @@
         <w:pStyle w:val="Heading1"/>
         <w:keepNext/>
         <w:keepLines/>
+        <w:outlineLvl w:val="9"/>
       </w:pPr>
       <w:r>
         <w:t xml:space="preserve">Table of Contents</w:t>
@@ -467,18 +495,19 @@
           </w:r>
         </w:p>
         <w:p>
+          <w:pPr>
+            <w:spacing w:before="0" w:after="0" w:line="20" w:lineRule="exact"/>
+          </w:pPr>
           <w:r>
+            <w:rPr>
+              <w:sz w:val="2"/>
+            </w:rPr>
             <w:fldChar w:fldCharType="end"/>
           </w:r>
         </w:p>
       </w:sdtContent>
     </w:sdt>
     <w:p>
-      <w:r>
-        <w:br w:type="page"/>
-      </w:r>
-    </w:p>
-    <w:p>
       <w:pPr>
         <w:pStyle w:val="Heading1"/>
         <w:keepNext/>
@@ -498,6 +527,105 @@
       <w:r>
         <w:t xml:space="preserve">You will understand Claude far faster after you have made it do one real thing. So before any theory, do this. It takes about ten minutes and produces a finished document you can keep.</w:t>
       </w:r>
+    </w:p>
+    <w:tbl>
+      <w:tblPr>
+        <w:tblW w:type="dxa" w:w="9026"/>
+      </w:tblPr>
+      <w:tblGrid>
+        <w:gridCol w:w="9026"/>
+      </w:tblGrid>
+      <w:tr>
+        <w:trPr>
+          <w:cantSplit/>
+        </w:trPr>
+        <w:tc>
+          <w:tcPr>
+            <w:tcW w:type="dxa" w:w="9026"/>
+            <w:tcBorders>
+              <w:top w:val="single" w:color="B7892B" w:sz="2"/>
+              <w:left w:val="single" w:color="B7892B" w:sz="18"/>
+              <w:bottom w:val="single" w:color="B7892B" w:sz="2"/>
+              <w:right w:val="single" w:color="B7892B" w:sz="2"/>
+            </w:tcBorders>
+            <w:shd w:fill="FFF6E0" w:val="clear"/>
+            <w:tcMar>
+              <w:top w:type="dxa" w:w="120"/>
+              <w:left w:type="dxa" w:w="200"/>
+              <w:bottom w:type="dxa" w:w="120"/>
+              <w:right w:type="dxa" w:w="160"/>
+            </w:tcMar>
+          </w:tcPr>
+          <w:p>
+            <w:pPr>
+              <w:keepNext/>
+              <w:spacing w:after="60"/>
+            </w:pPr>
+            <w:r>
+              <w:rPr>
+                <w:b/>
+                <w:bCs/>
+                <w:color w:val="B7892B"/>
+                <w:sz w:val="22"/>
+                <w:szCs w:val="22"/>
+              </w:rPr>
+              <w:t xml:space="preserve">On the free plan? Do this instead</w:t>
+            </w:r>
+          </w:p>
+          <w:p>
+            <w:pPr>
+              <w:keepLines/>
+              <w:widowControl/>
+              <w:spacing w:after="60" w:line="262"/>
+            </w:pPr>
+            <w:r>
+              <w:t xml:space="preserve">Cowork needs a paid plan. On the free plan, open </w:t>
+            </w:r>
+            <w:r>
+              <w:rPr>
+                <w:b/>
+                <w:bCs/>
+              </w:rPr>
+              <w:t xml:space="preserve">claude.ai</w:t>
+            </w:r>
+            <w:r>
+              <w:t xml:space="preserve"> and start a chat.</w:t>
+            </w:r>
+          </w:p>
+          <w:p>
+            <w:pPr>
+              <w:keepLines/>
+              <w:widowControl/>
+              <w:spacing w:after="60" w:line="262"/>
+            </w:pPr>
+            <w:r>
+              <w:t xml:space="preserve">Paste the text of a short document and type: </w:t>
+            </w:r>
+            <w:r>
+              <w:rPr>
+                <w:b/>
+                <w:bCs/>
+              </w:rPr>
+              <w:t xml:space="preserve">"Summarise this in one page, then give me three key takeaways."</w:t>
+            </w:r>
+          </w:p>
+          <w:p>
+            <w:pPr>
+              <w:keepLines/>
+              <w:widowControl/>
+              <w:spacing w:after="60" w:line="262"/>
+            </w:pPr>
+            <w:r>
+              <w:t xml:space="preserve">Then refine it, exactly as in step 6. Come back to Cowork when you upgrade.</w:t>
+            </w:r>
+          </w:p>
+        </w:tc>
+      </w:tr>
+    </w:tbl>
+    <w:p>
+      <w:pPr>
+        <w:spacing w:after="80" w:line="120" w:lineRule="exact"/>
+      </w:pPr>
     </w:p>
     <w:p>
       <w:pPr>
@@ -542,7 +670,7 @@
         <w:t xml:space="preserve">Set the engine. </w:t>
       </w:r>
       <w:r>
-        <w:t xml:space="preserve">Choose the Opus model, and switch on Extended Thinking and Web Search.</w:t>
+        <w:t xml:space="preserve">Choose the Opus model (the most capable one), and switch on Extended Thinking (Claude thinks before it answers) and Web Search (it checks facts online).</w:t>
       </w:r>
     </w:p>
     <w:p>
@@ -562,7 +690,7 @@
           <w:b/>
           <w:bCs/>
         </w:rPr>
-        <w:t xml:space="preserve">Open Cowork and point it at a folder </w:t>
+        <w:t xml:space="preserve">Open Cowork (Claude working on the files in one folder) and point it at a folder </w:t>
       </w:r>
       <w:r>
         <w:t xml:space="preserve">that contains one document you know — a PDF or a Word file.</w:t>
@@ -2323,7 +2451,7 @@
               <w:spacing w:after="100" w:line="262"/>
             </w:pPr>
             <w:r>
-              <w:t xml:space="preserve">The most capable models (Opus and Sonnet) can hold about 1,000,000 tokens at once — very roughly 750,000 words, since a token is about three-quarters of a word; the small fast one (Haiku) holds about 200,000. That is huge — but, as Chapter 12 explains, fuller is not always better.</w:t>
+              <w:t xml:space="preserve">The most capable models (Opus and Sonnet) can hold about 1,000,000 tokens at once (this is called the context window) — very roughly 750,000 words, since a token is about three-quarters of a word; the small fast one (Haiku) holds about 200,000. That is huge — but, as Chapter 12 explains, fuller is not always better.</w:t>
             </w:r>
           </w:p>
         </w:tc>
@@ -2476,7 +2604,7 @@
               <w:spacing w:after="100" w:line="262"/>
             </w:pPr>
             <w:r>
-              <w:t xml:space="preserve">Opus + Extended Thinking + Web Search turned on is what separates the people who get great results from everyone else. It costs nothing extra and takes one minute.</w:t>
+              <w:t xml:space="preserve">In my experience, Opus + Extended Thinking + Web Search turned on makes the biggest difference to your results. It takes one minute to set up.</w:t>
             </w:r>
           </w:p>
         </w:tc>
@@ -2848,7 +2976,7 @@
         <w:spacing w:after="100" w:line="262"/>
       </w:pPr>
       <w:r>
-        <w:t xml:space="preserve">Feel the "agent" side: </w:t>
+        <w:t xml:space="preserve">Feel the "agent" side (Claude acting on its own, step by step): </w:t>
       </w:r>
       <w:r>
         <w:rPr>
@@ -3924,7 +4052,7 @@
         <w:t xml:space="preserve">a file only really exists for you once it is saved into the folder you selected.</w:t>
       </w:r>
       <w:r>
-        <w:t xml:space="preserve"> If Claude says it made something but you cannot find it, it is almost always still in the scratchpad or sandbox and needs saving to your folder.</w:t>
+        <w:t xml:space="preserve"> If Claude says it made something but you cannot find it, it is almost always still in the scratchpad (Claude's private draft area) or the sandbox (a temporary, closed-off computer Claude works in) and needs saving to your folder.</w:t>
       </w:r>
     </w:p>
     <w:p>
@@ -4930,7 +5058,7 @@
         <w:spacing w:after="100" w:line="262"/>
       </w:pPr>
       <w:r>
-        <w:t xml:space="preserve">When Claude needs to run something — convert a file, crunch numbers, build a spreadsheet — it does it inside a sandbox: a small, isolated Linux computer that spins up just for your session.</w:t>
+        <w:t xml:space="preserve">When Claude needs to run something — convert a file, crunch numbers, build a spreadsheet — it does it inside a sandbox: a small, isolated Linux computer (Linux is an operating system, like Windows) that spins up just for your session.</w:t>
       </w:r>
     </w:p>
     <w:p>
@@ -5057,7 +5185,7 @@
         <w:t xml:space="preserve">A real computer. </w:t>
       </w:r>
       <w:r>
-        <w:t xml:space="preserve">It has Python, Node, and common tools, so Claude can genuinely build and test, not just describe.</w:t>
+        <w:t xml:space="preserve">It has Python and Node (programming languages) and common tools, so Claude can genuinely build and test, not just describe.</w:t>
       </w:r>
     </w:p>
     <w:p>
@@ -5068,7 +5196,7 @@
         <w:spacing w:after="100" w:line="262"/>
       </w:pPr>
       <w:r>
-        <w:t xml:space="preserve">Your "security perimeter" is simply the sum of the access you grant — the folder you connect, the connectors you switch on, and whether you allow computer use. Keep each as small as the task needs.</w:t>
+        <w:t xml:space="preserve">Your "security perimeter" is simply the sum of the access you grant — the folder you connect, the connectors you switch on, and whether you allow computer use (Claude moving your mouse and typing on your screen). Keep each as small as the task needs.</w:t>
       </w:r>
     </w:p>
     <w:tbl>
@@ -5254,7 +5382,7 @@
         <w:spacing w:after="46" w:line="258"/>
       </w:pPr>
       <w:r>
-        <w:t xml:space="preserve">A format converter (for example Markdown to Word) occasionally drops the tail of the document.</w:t>
+        <w:t xml:space="preserve">A format converter (for example Markdown, a plain-text format with simple formatting, to Word) occasionally drops the tail of the document.</w:t>
       </w:r>
     </w:p>
     <w:p>
@@ -5700,7 +5828,7 @@
               <w:spacing w:after="100" w:line="262"/>
             </w:pPr>
             <w:r>
-              <w:t xml:space="preserve">The busy window in Europe is roughly 14:00–20:00. When you can, do heavy sessions in the morning — it is faster and you waste less of your allowance waiting.</w:t>
+              <w:t xml:space="preserve">In my experience, the busy window in Europe is roughly 14:00–20:00. When you can, do heavy sessions in the morning — it is faster and you waste less of your allowance waiting.</w:t>
             </w:r>
           </w:p>
         </w:tc>
@@ -5745,7 +5873,7 @@
         <w:spacing w:after="100" w:line="262"/>
       </w:pPr>
       <w:r>
-        <w:t xml:space="preserve">Start a fresh chat when the conversation passes roughly 50 messages or you have uploaded several big files; when you change topic; or when Claude starts repeating itself. A good rhythm: one topic per session, an hour or two at most.</w:t>
+        <w:t xml:space="preserve">My rule of thumb: start a fresh chat when the conversation passes roughly 50 messages or you have uploaded several big files; when you change topic; or when Claude starts repeating itself. A good rhythm: one topic per session, an hour or two at most.</w:t>
       </w:r>
     </w:p>
     <w:p>
@@ -5799,7 +5927,7 @@
         <w:t xml:space="preserve">Keep instruction files short </w:t>
       </w:r>
       <w:r>
-        <w:t xml:space="preserve">(aim under 500 words).</w:t>
+        <w:t xml:space="preserve">(in my experience, under 500 words works best).</w:t>
       </w:r>
     </w:p>
     <w:p>
@@ -6298,7 +6426,7 @@
           <w:b/>
           <w:bCs/>
         </w:rPr>
-        <w:t xml:space="preserve">Be careful with "skip permissions." </w:t>
+        <w:t xml:space="preserve">Be careful with "skip permissions" (letting Claude act without asking you first). </w:t>
       </w:r>
       <w:r>
         <w:t xml:space="preserve">Only turn it off where the files could be replaced.</w:t>
@@ -6324,7 +6452,7 @@
         <w:t xml:space="preserve">Never paste secrets. </w:t>
       </w:r>
       <w:r>
-        <w:t xml:space="preserve">API keys and passwords belong in a local config file, not a chat.</w:t>
+        <w:t xml:space="preserve">API keys (secret codes that let a program use a service) and passwords belong in a local settings file, not a chat.</w:t>
       </w:r>
     </w:p>
     <w:p>
@@ -7382,6 +7510,23 @@
         <w:t xml:space="preserve">16. Plain-language glossary</w:t>
       </w:r>
     </w:p>
+    <w:p>
+      <w:pPr>
+        <w:keepNext/>
+        <w:keepLines/>
+        <w:spacing w:before="160" w:after="60"/>
+      </w:pPr>
+      <w:r>
+        <w:rPr>
+          <w:b/>
+          <w:bCs/>
+          <w:color w:val="1F3A5F"/>
+          <w:sz w:val="24"/>
+          <w:szCs w:val="24"/>
+        </w:rPr>
+        <w:t xml:space="preserve">AI words</w:t>
+      </w:r>
+    </w:p>
     <w:tbl>
       <w:tblPr>
         <w:tblW w:type="dxa" w:w="9026"/>
@@ -7395,8 +7540,8 @@
         </w:tblBorders>
       </w:tblPr>
       <w:tblGrid>
-        <w:gridCol w:w="2600"/>
-        <w:gridCol w:w="6426"/>
+        <w:gridCol w:w="2300"/>
+        <w:gridCol w:w="6726"/>
       </w:tblGrid>
       <w:tr>
         <w:trPr>
@@ -7405,16 +7550,20 @@
         </w:trPr>
         <w:tc>
           <w:tcPr>
-            <w:tcW w:type="dxa" w:w="2600"/>
+            <w:tcW w:type="dxa" w:w="2300"/>
             <w:shd w:fill="1F3A5F" w:val="clear"/>
             <w:tcMar>
-              <w:top w:type="dxa" w:w="80"/>
-              <w:left w:type="dxa" w:w="120"/>
-              <w:bottom w:type="dxa" w:w="80"/>
-              <w:right w:type="dxa" w:w="120"/>
-            </w:tcMar>
-          </w:tcPr>
-          <w:p>
+              <w:top w:type="dxa" w:w="70"/>
+              <w:left w:type="dxa" w:w="120"/>
+              <w:bottom w:type="dxa" w:w="70"/>
+              <w:right w:type="dxa" w:w="120"/>
+            </w:tcMar>
+          </w:tcPr>
+          <w:p>
+            <w:pPr>
+              <w:keepNext/>
+              <w:spacing w:after="0"/>
+            </w:pPr>
             <w:r>
               <w:rPr>
                 <w:b/>
@@ -7429,16 +7578,20 @@
         </w:tc>
         <w:tc>
           <w:tcPr>
-            <w:tcW w:type="dxa" w:w="6426"/>
+            <w:tcW w:type="dxa" w:w="6726"/>
             <w:shd w:fill="1F3A5F" w:val="clear"/>
             <w:tcMar>
-              <w:top w:type="dxa" w:w="80"/>
-              <w:left w:type="dxa" w:w="120"/>
-              <w:bottom w:type="dxa" w:w="80"/>
-              <w:right w:type="dxa" w:w="120"/>
-            </w:tcMar>
-          </w:tcPr>
-          <w:p>
+              <w:top w:type="dxa" w:w="70"/>
+              <w:left w:type="dxa" w:w="120"/>
+              <w:bottom w:type="dxa" w:w="70"/>
+              <w:right w:type="dxa" w:w="120"/>
+            </w:tcMar>
+          </w:tcPr>
+          <w:p>
+            <w:pPr>
+              <w:keepNext/>
+              <w:spacing w:after="0"/>
+            </w:pPr>
             <w:r>
               <w:rPr>
                 <w:b/>
@@ -7458,7 +7611,7 @@
         </w:trPr>
         <w:tc>
           <w:tcPr>
-            <w:tcW w:type="dxa" w:w="2600"/>
+            <w:tcW w:type="dxa" w:w="2300"/>
             <w:shd w:fill="EDF2F7" w:val="clear"/>
             <w:tcMar>
               <w:top w:type="dxa" w:w="70"/>
@@ -7468,6 +7621,9 @@
             </w:tcMar>
           </w:tcPr>
           <w:p>
+            <w:pPr>
+              <w:spacing w:after="0"/>
+            </w:pPr>
             <w:r>
               <w:rPr>
                 <w:sz w:val="21"/>
@@ -7479,7 +7635,7 @@
         </w:tc>
         <w:tc>
           <w:tcPr>
-            <w:tcW w:type="dxa" w:w="6426"/>
+            <w:tcW w:type="dxa" w:w="6726"/>
             <w:shd w:fill="EDF2F7" w:val="clear"/>
             <w:tcMar>
               <w:top w:type="dxa" w:w="70"/>
@@ -7489,12 +7645,15 @@
             </w:tcMar>
           </w:tcPr>
           <w:p>
-            <w:r>
-              <w:rPr>
-                <w:sz w:val="21"/>
-                <w:szCs w:val="21"/>
-              </w:rPr>
-              <w:t xml:space="preserve">The engine doing the thinking (Opus, Sonnet, Haiku). Smarter engines cost more.</w:t>
+            <w:pPr>
+              <w:spacing w:after="0"/>
+            </w:pPr>
+            <w:r>
+              <w:rPr>
+                <w:sz w:val="21"/>
+                <w:szCs w:val="21"/>
+              </w:rPr>
+              <w:t xml:space="preserve">The engine doing the thinking (Opus, Sonnet, Haiku). Smarter engines use more of your allowance.</w:t>
             </w:r>
           </w:p>
         </w:tc>
@@ -7505,7 +7664,7 @@
         </w:trPr>
         <w:tc>
           <w:tcPr>
-            <w:tcW w:type="dxa" w:w="2600"/>
+            <w:tcW w:type="dxa" w:w="2300"/>
             <w:shd w:fill="FFFFFF" w:val="clear"/>
             <w:tcMar>
               <w:top w:type="dxa" w:w="70"/>
@@ -7515,6 +7674,9 @@
             </w:tcMar>
           </w:tcPr>
           <w:p>
+            <w:pPr>
+              <w:spacing w:after="0"/>
+            </w:pPr>
             <w:r>
               <w:rPr>
                 <w:sz w:val="21"/>
@@ -7526,7 +7688,7 @@
         </w:tc>
         <w:tc>
           <w:tcPr>
-            <w:tcW w:type="dxa" w:w="6426"/>
+            <w:tcW w:type="dxa" w:w="6726"/>
             <w:shd w:fill="FFFFFF" w:val="clear"/>
             <w:tcMar>
               <w:top w:type="dxa" w:w="70"/>
@@ -7536,6 +7698,9 @@
             </w:tcMar>
           </w:tcPr>
           <w:p>
+            <w:pPr>
+              <w:spacing w:after="0"/>
+            </w:pPr>
             <w:r>
               <w:rPr>
                 <w:sz w:val="21"/>
@@ -7552,7 +7717,7 @@
         </w:trPr>
         <w:tc>
           <w:tcPr>
-            <w:tcW w:type="dxa" w:w="2600"/>
+            <w:tcW w:type="dxa" w:w="2300"/>
             <w:shd w:fill="EDF2F7" w:val="clear"/>
             <w:tcMar>
               <w:top w:type="dxa" w:w="70"/>
@@ -7562,6 +7727,9 @@
             </w:tcMar>
           </w:tcPr>
           <w:p>
+            <w:pPr>
+              <w:spacing w:after="0"/>
+            </w:pPr>
             <w:r>
               <w:rPr>
                 <w:sz w:val="21"/>
@@ -7573,7 +7741,7 @@
         </w:tc>
         <w:tc>
           <w:tcPr>
-            <w:tcW w:type="dxa" w:w="6426"/>
+            <w:tcW w:type="dxa" w:w="6726"/>
             <w:shd w:fill="EDF2F7" w:val="clear"/>
             <w:tcMar>
               <w:top w:type="dxa" w:w="70"/>
@@ -7583,6 +7751,9 @@
             </w:tcMar>
           </w:tcPr>
           <w:p>
+            <w:pPr>
+              <w:spacing w:after="0"/>
+            </w:pPr>
             <w:r>
               <w:rPr>
                 <w:sz w:val="21"/>
@@ -7599,7 +7770,7 @@
         </w:trPr>
         <w:tc>
           <w:tcPr>
-            <w:tcW w:type="dxa" w:w="2600"/>
+            <w:tcW w:type="dxa" w:w="2300"/>
             <w:shd w:fill="FFFFFF" w:val="clear"/>
             <w:tcMar>
               <w:top w:type="dxa" w:w="70"/>
@@ -7609,6 +7780,9 @@
             </w:tcMar>
           </w:tcPr>
           <w:p>
+            <w:pPr>
+              <w:spacing w:after="0"/>
+            </w:pPr>
             <w:r>
               <w:rPr>
                 <w:sz w:val="21"/>
@@ -7620,7 +7794,7 @@
         </w:tc>
         <w:tc>
           <w:tcPr>
-            <w:tcW w:type="dxa" w:w="6426"/>
+            <w:tcW w:type="dxa" w:w="6726"/>
             <w:shd w:fill="FFFFFF" w:val="clear"/>
             <w:tcMar>
               <w:top w:type="dxa" w:w="70"/>
@@ -7630,12 +7804,15 @@
             </w:tcMar>
           </w:tcPr>
           <w:p>
-            <w:r>
-              <w:rPr>
-                <w:sz w:val="21"/>
-                <w:szCs w:val="21"/>
-              </w:rPr>
-              <w:t xml:space="preserve">A chunk of text (roughly three-quarters of a word). Limits and costs are counted in tokens.</w:t>
+            <w:pPr>
+              <w:spacing w:after="0"/>
+            </w:pPr>
+            <w:r>
+              <w:rPr>
+                <w:sz w:val="21"/>
+                <w:szCs w:val="21"/>
+              </w:rPr>
+              <w:t xml:space="preserve">A chunk of text, roughly three-quarters of a word. Limits and costs are counted in tokens.</w:t>
             </w:r>
           </w:p>
         </w:tc>
@@ -7646,7 +7823,7 @@
         </w:trPr>
         <w:tc>
           <w:tcPr>
-            <w:tcW w:type="dxa" w:w="2600"/>
+            <w:tcW w:type="dxa" w:w="2300"/>
             <w:shd w:fill="EDF2F7" w:val="clear"/>
             <w:tcMar>
               <w:top w:type="dxa" w:w="70"/>
@@ -7656,6 +7833,9 @@
             </w:tcMar>
           </w:tcPr>
           <w:p>
+            <w:pPr>
+              <w:spacing w:after="0"/>
+            </w:pPr>
             <w:r>
               <w:rPr>
                 <w:sz w:val="21"/>
@@ -7667,7 +7847,7 @@
         </w:tc>
         <w:tc>
           <w:tcPr>
-            <w:tcW w:type="dxa" w:w="6426"/>
+            <w:tcW w:type="dxa" w:w="6726"/>
             <w:shd w:fill="EDF2F7" w:val="clear"/>
             <w:tcMar>
               <w:top w:type="dxa" w:w="70"/>
@@ -7677,6 +7857,9 @@
             </w:tcMar>
           </w:tcPr>
           <w:p>
+            <w:pPr>
+              <w:spacing w:after="0"/>
+            </w:pPr>
             <w:r>
               <w:rPr>
                 <w:sz w:val="21"/>
@@ -7693,7 +7876,7 @@
         </w:trPr>
         <w:tc>
           <w:tcPr>
-            <w:tcW w:type="dxa" w:w="2600"/>
+            <w:tcW w:type="dxa" w:w="2300"/>
             <w:shd w:fill="FFFFFF" w:val="clear"/>
             <w:tcMar>
               <w:top w:type="dxa" w:w="70"/>
@@ -7703,6 +7886,9 @@
             </w:tcMar>
           </w:tcPr>
           <w:p>
+            <w:pPr>
+              <w:spacing w:after="0"/>
+            </w:pPr>
             <w:r>
               <w:rPr>
                 <w:sz w:val="21"/>
@@ -7714,7 +7900,7 @@
         </w:tc>
         <w:tc>
           <w:tcPr>
-            <w:tcW w:type="dxa" w:w="6426"/>
+            <w:tcW w:type="dxa" w:w="6726"/>
             <w:shd w:fill="FFFFFF" w:val="clear"/>
             <w:tcMar>
               <w:top w:type="dxa" w:w="70"/>
@@ -7724,6 +7910,9 @@
             </w:tcMar>
           </w:tcPr>
           <w:p>
+            <w:pPr>
+              <w:spacing w:after="0"/>
+            </w:pPr>
             <w:r>
               <w:rPr>
                 <w:sz w:val="21"/>
@@ -7740,7 +7929,7 @@
         </w:trPr>
         <w:tc>
           <w:tcPr>
-            <w:tcW w:type="dxa" w:w="2600"/>
+            <w:tcW w:type="dxa" w:w="2300"/>
             <w:shd w:fill="EDF2F7" w:val="clear"/>
             <w:tcMar>
               <w:top w:type="dxa" w:w="70"/>
@@ -7750,18 +7939,21 @@
             </w:tcMar>
           </w:tcPr>
           <w:p>
-            <w:r>
-              <w:rPr>
-                <w:sz w:val="21"/>
-                <w:szCs w:val="21"/>
-              </w:rPr>
-              <w:t xml:space="preserve">Sandbox</w:t>
-            </w:r>
-          </w:p>
-        </w:tc>
-        <w:tc>
-          <w:tcPr>
-            <w:tcW w:type="dxa" w:w="6426"/>
+            <w:pPr>
+              <w:spacing w:after="0"/>
+            </w:pPr>
+            <w:r>
+              <w:rPr>
+                <w:sz w:val="21"/>
+                <w:szCs w:val="21"/>
+              </w:rPr>
+              <w:t xml:space="preserve">Web Search</w:t>
+            </w:r>
+          </w:p>
+        </w:tc>
+        <w:tc>
+          <w:tcPr>
+            <w:tcW w:type="dxa" w:w="6726"/>
             <w:shd w:fill="EDF2F7" w:val="clear"/>
             <w:tcMar>
               <w:top w:type="dxa" w:w="70"/>
@@ -7771,12 +7963,15 @@
             </w:tcMar>
           </w:tcPr>
           <w:p>
-            <w:r>
-              <w:rPr>
-                <w:sz w:val="21"/>
-                <w:szCs w:val="21"/>
-              </w:rPr>
-              <w:t xml:space="preserve">A temporary, isolated Linux computer Claude uses to run code safely.</w:t>
+            <w:pPr>
+              <w:spacing w:after="0"/>
+            </w:pPr>
+            <w:r>
+              <w:rPr>
+                <w:sz w:val="21"/>
+                <w:szCs w:val="21"/>
+              </w:rPr>
+              <w:t xml:space="preserve">Lets Claude check facts online instead of guessing.</w:t>
             </w:r>
           </w:p>
         </w:tc>
@@ -7787,7 +7982,7 @@
         </w:trPr>
         <w:tc>
           <w:tcPr>
-            <w:tcW w:type="dxa" w:w="2600"/>
+            <w:tcW w:type="dxa" w:w="2300"/>
             <w:shd w:fill="FFFFFF" w:val="clear"/>
             <w:tcMar>
               <w:top w:type="dxa" w:w="70"/>
@@ -7797,18 +7992,21 @@
             </w:tcMar>
           </w:tcPr>
           <w:p>
-            <w:r>
-              <w:rPr>
-                <w:sz w:val="21"/>
-                <w:szCs w:val="21"/>
-              </w:rPr>
-              <w:t xml:space="preserve">Scratchpad</w:t>
-            </w:r>
-          </w:p>
-        </w:tc>
-        <w:tc>
-          <w:tcPr>
-            <w:tcW w:type="dxa" w:w="6426"/>
+            <w:pPr>
+              <w:spacing w:after="0"/>
+            </w:pPr>
+            <w:r>
+              <w:rPr>
+                <w:sz w:val="21"/>
+                <w:szCs w:val="21"/>
+              </w:rPr>
+              <w:t xml:space="preserve">Agent</w:t>
+            </w:r>
+          </w:p>
+        </w:tc>
+        <w:tc>
+          <w:tcPr>
+            <w:tcW w:type="dxa" w:w="6726"/>
             <w:shd w:fill="FFFFFF" w:val="clear"/>
             <w:tcMar>
               <w:top w:type="dxa" w:w="70"/>
@@ -7818,12 +8016,116 @@
             </w:tcMar>
           </w:tcPr>
           <w:p>
-            <w:r>
-              <w:rPr>
-                <w:sz w:val="21"/>
-                <w:szCs w:val="21"/>
-              </w:rPr>
-              <w:t xml:space="preserve">Claude's private draft area, before a file is saved into your folder.</w:t>
+            <w:pPr>
+              <w:spacing w:after="0"/>
+            </w:pPr>
+            <w:r>
+              <w:rPr>
+                <w:sz w:val="21"/>
+                <w:szCs w:val="21"/>
+              </w:rPr>
+              <w:t xml:space="preserve">Claude working toward a goal on its own, step by step.</w:t>
+            </w:r>
+          </w:p>
+        </w:tc>
+      </w:tr>
+    </w:tbl>
+    <w:p>
+      <w:pPr>
+        <w:spacing w:after="80" w:line="120" w:lineRule="exact"/>
+      </w:pPr>
+    </w:p>
+    <w:p>
+      <w:pPr>
+        <w:keepNext/>
+        <w:keepLines/>
+        <w:spacing w:before="160" w:after="60"/>
+      </w:pPr>
+      <w:r>
+        <w:rPr>
+          <w:b/>
+          <w:bCs/>
+          <w:color w:val="1F3A5F"/>
+          <w:sz w:val="24"/>
+          <w:szCs w:val="24"/>
+        </w:rPr>
+        <w:t xml:space="preserve">Where your files live</w:t>
+      </w:r>
+    </w:p>
+    <w:tbl>
+      <w:tblPr>
+        <w:tblW w:type="dxa" w:w="9026"/>
+        <w:tblBorders>
+          <w:top w:val="single" w:color="CCCCCC" w:sz="1"/>
+          <w:left w:val="single" w:color="CCCCCC" w:sz="1"/>
+          <w:bottom w:val="single" w:color="CCCCCC" w:sz="1"/>
+          <w:right w:val="single" w:color="CCCCCC" w:sz="1"/>
+          <w:insideH w:val="single" w:color="CCCCCC" w:sz="1"/>
+          <w:insideV w:val="single" w:color="CCCCCC" w:sz="1"/>
+        </w:tblBorders>
+      </w:tblPr>
+      <w:tblGrid>
+        <w:gridCol w:w="2300"/>
+        <w:gridCol w:w="6726"/>
+      </w:tblGrid>
+      <w:tr>
+        <w:trPr>
+          <w:cantSplit/>
+          <w:tblHeader/>
+        </w:trPr>
+        <w:tc>
+          <w:tcPr>
+            <w:tcW w:type="dxa" w:w="2300"/>
+            <w:shd w:fill="1F3A5F" w:val="clear"/>
+            <w:tcMar>
+              <w:top w:type="dxa" w:w="70"/>
+              <w:left w:type="dxa" w:w="120"/>
+              <w:bottom w:type="dxa" w:w="70"/>
+              <w:right w:type="dxa" w:w="120"/>
+            </w:tcMar>
+          </w:tcPr>
+          <w:p>
+            <w:pPr>
+              <w:keepNext/>
+              <w:spacing w:after="0"/>
+            </w:pPr>
+            <w:r>
+              <w:rPr>
+                <w:b/>
+                <w:bCs/>
+                <w:color w:val="FFFFFF"/>
+                <w:sz w:val="21"/>
+                <w:szCs w:val="21"/>
+              </w:rPr>
+              <w:t xml:space="preserve">Term</w:t>
+            </w:r>
+          </w:p>
+        </w:tc>
+        <w:tc>
+          <w:tcPr>
+            <w:tcW w:type="dxa" w:w="6726"/>
+            <w:shd w:fill="1F3A5F" w:val="clear"/>
+            <w:tcMar>
+              <w:top w:type="dxa" w:w="70"/>
+              <w:left w:type="dxa" w:w="120"/>
+              <w:bottom w:type="dxa" w:w="70"/>
+              <w:right w:type="dxa" w:w="120"/>
+            </w:tcMar>
+          </w:tcPr>
+          <w:p>
+            <w:pPr>
+              <w:keepNext/>
+              <w:spacing w:after="0"/>
+            </w:pPr>
+            <w:r>
+              <w:rPr>
+                <w:b/>
+                <w:bCs/>
+                <w:color w:val="FFFFFF"/>
+                <w:sz w:val="21"/>
+                <w:szCs w:val="21"/>
+              </w:rPr>
+              <w:t xml:space="preserve">In plain words</w:t>
             </w:r>
           </w:p>
         </w:tc>
@@ -7834,7 +8136,7 @@
         </w:trPr>
         <w:tc>
           <w:tcPr>
-            <w:tcW w:type="dxa" w:w="2600"/>
+            <w:tcW w:type="dxa" w:w="2300"/>
             <w:shd w:fill="EDF2F7" w:val="clear"/>
             <w:tcMar>
               <w:top w:type="dxa" w:w="70"/>
@@ -7844,18 +8146,21 @@
             </w:tcMar>
           </w:tcPr>
           <w:p>
-            <w:r>
-              <w:rPr>
-                <w:sz w:val="21"/>
-                <w:szCs w:val="21"/>
-              </w:rPr>
-              <w:t xml:space="preserve">Truncation</w:t>
-            </w:r>
-          </w:p>
-        </w:tc>
-        <w:tc>
-          <w:tcPr>
-            <w:tcW w:type="dxa" w:w="6426"/>
+            <w:pPr>
+              <w:spacing w:after="0"/>
+            </w:pPr>
+            <w:r>
+              <w:rPr>
+                <w:sz w:val="21"/>
+                <w:szCs w:val="21"/>
+              </w:rPr>
+              <w:t xml:space="preserve">Cowork</w:t>
+            </w:r>
+          </w:p>
+        </w:tc>
+        <w:tc>
+          <w:tcPr>
+            <w:tcW w:type="dxa" w:w="6726"/>
             <w:shd w:fill="EDF2F7" w:val="clear"/>
             <w:tcMar>
               <w:top w:type="dxa" w:w="70"/>
@@ -7865,12 +8170,15 @@
             </w:tcMar>
           </w:tcPr>
           <w:p>
-            <w:r>
-              <w:rPr>
-                <w:sz w:val="21"/>
-                <w:szCs w:val="21"/>
-              </w:rPr>
-              <w:t xml:space="preserve">A file getting silently cut off, usually at the end. See Chapter 11.</w:t>
+            <w:pPr>
+              <w:spacing w:after="0"/>
+            </w:pPr>
+            <w:r>
+              <w:rPr>
+                <w:sz w:val="21"/>
+                <w:szCs w:val="21"/>
+              </w:rPr>
+              <w:t xml:space="preserve">The desktop agent that works inside a folder and produces finished files.</w:t>
             </w:r>
           </w:p>
         </w:tc>
@@ -7881,7 +8189,7 @@
         </w:trPr>
         <w:tc>
           <w:tcPr>
-            <w:tcW w:type="dxa" w:w="2600"/>
+            <w:tcW w:type="dxa" w:w="2300"/>
             <w:shd w:fill="FFFFFF" w:val="clear"/>
             <w:tcMar>
               <w:top w:type="dxa" w:w="70"/>
@@ -7891,18 +8199,21 @@
             </w:tcMar>
           </w:tcPr>
           <w:p>
-            <w:r>
-              <w:rPr>
-                <w:sz w:val="21"/>
-                <w:szCs w:val="21"/>
-              </w:rPr>
-              <w:t xml:space="preserve">Cowork</w:t>
-            </w:r>
-          </w:p>
-        </w:tc>
-        <w:tc>
-          <w:tcPr>
-            <w:tcW w:type="dxa" w:w="6426"/>
+            <w:pPr>
+              <w:spacing w:after="0"/>
+            </w:pPr>
+            <w:r>
+              <w:rPr>
+                <w:sz w:val="21"/>
+                <w:szCs w:val="21"/>
+              </w:rPr>
+              <w:t xml:space="preserve">Sandbox</w:t>
+            </w:r>
+          </w:p>
+        </w:tc>
+        <w:tc>
+          <w:tcPr>
+            <w:tcW w:type="dxa" w:w="6726"/>
             <w:shd w:fill="FFFFFF" w:val="clear"/>
             <w:tcMar>
               <w:top w:type="dxa" w:w="70"/>
@@ -7912,12 +8223,15 @@
             </w:tcMar>
           </w:tcPr>
           <w:p>
-            <w:r>
-              <w:rPr>
-                <w:sz w:val="21"/>
-                <w:szCs w:val="21"/>
-              </w:rPr>
-              <w:t xml:space="preserve">The desktop agent that works inside a folder and produces finished files.</w:t>
+            <w:pPr>
+              <w:spacing w:after="0"/>
+            </w:pPr>
+            <w:r>
+              <w:rPr>
+                <w:sz w:val="21"/>
+                <w:szCs w:val="21"/>
+              </w:rPr>
+              <w:t xml:space="preserve">A temporary, isolated Linux computer Claude uses to run code safely.</w:t>
             </w:r>
           </w:p>
         </w:tc>
@@ -7928,7 +8242,7 @@
         </w:trPr>
         <w:tc>
           <w:tcPr>
-            <w:tcW w:type="dxa" w:w="2600"/>
+            <w:tcW w:type="dxa" w:w="2300"/>
             <w:shd w:fill="EDF2F7" w:val="clear"/>
             <w:tcMar>
               <w:top w:type="dxa" w:w="70"/>
@@ -7938,18 +8252,21 @@
             </w:tcMar>
           </w:tcPr>
           <w:p>
-            <w:r>
-              <w:rPr>
-                <w:sz w:val="21"/>
-                <w:szCs w:val="21"/>
-              </w:rPr>
-              <w:t xml:space="preserve">Dispatch</w:t>
-            </w:r>
-          </w:p>
-        </w:tc>
-        <w:tc>
-          <w:tcPr>
-            <w:tcW w:type="dxa" w:w="6426"/>
+            <w:pPr>
+              <w:spacing w:after="0"/>
+            </w:pPr>
+            <w:r>
+              <w:rPr>
+                <w:sz w:val="21"/>
+                <w:szCs w:val="21"/>
+              </w:rPr>
+              <w:t xml:space="preserve">Scratchpad</w:t>
+            </w:r>
+          </w:p>
+        </w:tc>
+        <w:tc>
+          <w:tcPr>
+            <w:tcW w:type="dxa" w:w="6726"/>
             <w:shd w:fill="EDF2F7" w:val="clear"/>
             <w:tcMar>
               <w:top w:type="dxa" w:w="70"/>
@@ -7959,12 +8276,15 @@
             </w:tcMar>
           </w:tcPr>
           <w:p>
-            <w:r>
-              <w:rPr>
-                <w:sz w:val="21"/>
-                <w:szCs w:val="21"/>
-              </w:rPr>
-              <w:t xml:space="preserve">Assigning a Cowork task from your phone; the desktop does the work.</w:t>
+            <w:pPr>
+              <w:spacing w:after="0"/>
+            </w:pPr>
+            <w:r>
+              <w:rPr>
+                <w:sz w:val="21"/>
+                <w:szCs w:val="21"/>
+              </w:rPr>
+              <w:t xml:space="preserve">Claude's private draft area, before a file is saved into your folder.</w:t>
             </w:r>
           </w:p>
         </w:tc>
@@ -7975,7 +8295,7 @@
         </w:trPr>
         <w:tc>
           <w:tcPr>
-            <w:tcW w:type="dxa" w:w="2600"/>
+            <w:tcW w:type="dxa" w:w="2300"/>
             <w:shd w:fill="FFFFFF" w:val="clear"/>
             <w:tcMar>
               <w:top w:type="dxa" w:w="70"/>
@@ -7985,18 +8305,21 @@
             </w:tcMar>
           </w:tcPr>
           <w:p>
-            <w:r>
-              <w:rPr>
-                <w:sz w:val="21"/>
-                <w:szCs w:val="21"/>
-              </w:rPr>
-              <w:t xml:space="preserve">Code</w:t>
-            </w:r>
-          </w:p>
-        </w:tc>
-        <w:tc>
-          <w:tcPr>
-            <w:tcW w:type="dxa" w:w="6426"/>
+            <w:pPr>
+              <w:spacing w:after="0"/>
+            </w:pPr>
+            <w:r>
+              <w:rPr>
+                <w:sz w:val="21"/>
+                <w:szCs w:val="21"/>
+              </w:rPr>
+              <w:t xml:space="preserve">Truncation</w:t>
+            </w:r>
+          </w:p>
+        </w:tc>
+        <w:tc>
+          <w:tcPr>
+            <w:tcW w:type="dxa" w:w="6726"/>
             <w:shd w:fill="FFFFFF" w:val="clear"/>
             <w:tcMar>
               <w:top w:type="dxa" w:w="70"/>
@@ -8006,12 +8329,15 @@
             </w:tcMar>
           </w:tcPr>
           <w:p>
-            <w:r>
-              <w:rPr>
-                <w:sz w:val="21"/>
-                <w:szCs w:val="21"/>
-              </w:rPr>
-              <w:t xml:space="preserve">Claude that writes and runs real software.</w:t>
+            <w:pPr>
+              <w:spacing w:after="0"/>
+            </w:pPr>
+            <w:r>
+              <w:rPr>
+                <w:sz w:val="21"/>
+                <w:szCs w:val="21"/>
+              </w:rPr>
+              <w:t xml:space="preserve">A file getting silently cut off, usually at the end. See Chapter 11.</w:t>
             </w:r>
           </w:p>
         </w:tc>
@@ -8022,7 +8348,7 @@
         </w:trPr>
         <w:tc>
           <w:tcPr>
-            <w:tcW w:type="dxa" w:w="2600"/>
+            <w:tcW w:type="dxa" w:w="2300"/>
             <w:shd w:fill="EDF2F7" w:val="clear"/>
             <w:tcMar>
               <w:top w:type="dxa" w:w="70"/>
@@ -8032,18 +8358,21 @@
             </w:tcMar>
           </w:tcPr>
           <w:p>
-            <w:r>
-              <w:rPr>
-                <w:sz w:val="21"/>
-                <w:szCs w:val="21"/>
-              </w:rPr>
-              <w:t xml:space="preserve">Project</w:t>
-            </w:r>
-          </w:p>
-        </w:tc>
-        <w:tc>
-          <w:tcPr>
-            <w:tcW w:type="dxa" w:w="6426"/>
+            <w:pPr>
+              <w:spacing w:after="0"/>
+            </w:pPr>
+            <w:r>
+              <w:rPr>
+                <w:sz w:val="21"/>
+                <w:szCs w:val="21"/>
+              </w:rPr>
+              <w:t xml:space="preserve">Files On-Demand</w:t>
+            </w:r>
+          </w:p>
+        </w:tc>
+        <w:tc>
+          <w:tcPr>
+            <w:tcW w:type="dxa" w:w="6726"/>
             <w:shd w:fill="EDF2F7" w:val="clear"/>
             <w:tcMar>
               <w:top w:type="dxa" w:w="70"/>
@@ -8053,12 +8382,15 @@
             </w:tcMar>
           </w:tcPr>
           <w:p>
-            <w:r>
-              <w:rPr>
-                <w:sz w:val="21"/>
-                <w:szCs w:val="21"/>
-              </w:rPr>
-              <w:t xml:space="preserve">A folder of chats sharing instructions and files.</w:t>
+            <w:pPr>
+              <w:spacing w:after="0"/>
+            </w:pPr>
+            <w:r>
+              <w:rPr>
+                <w:sz w:val="21"/>
+                <w:szCs w:val="21"/>
+              </w:rPr>
+              <w:t xml:space="preserve">A OneDrive setting where the real file stays in the cloud until you open it.</w:t>
             </w:r>
           </w:p>
         </w:tc>
@@ -8069,7 +8401,7 @@
         </w:trPr>
         <w:tc>
           <w:tcPr>
-            <w:tcW w:type="dxa" w:w="2600"/>
+            <w:tcW w:type="dxa" w:w="2300"/>
             <w:shd w:fill="FFFFFF" w:val="clear"/>
             <w:tcMar>
               <w:top w:type="dxa" w:w="70"/>
@@ -8079,18 +8411,21 @@
             </w:tcMar>
           </w:tcPr>
           <w:p>
-            <w:r>
-              <w:rPr>
-                <w:sz w:val="21"/>
-                <w:szCs w:val="21"/>
-              </w:rPr>
-              <w:t xml:space="preserve">Skill</w:t>
-            </w:r>
-          </w:p>
-        </w:tc>
-        <w:tc>
-          <w:tcPr>
-            <w:tcW w:type="dxa" w:w="6426"/>
+            <w:pPr>
+              <w:spacing w:after="0"/>
+            </w:pPr>
+            <w:r>
+              <w:rPr>
+                <w:sz w:val="21"/>
+                <w:szCs w:val="21"/>
+              </w:rPr>
+              <w:t xml:space="preserve">Markdown</w:t>
+            </w:r>
+          </w:p>
+        </w:tc>
+        <w:tc>
+          <w:tcPr>
+            <w:tcW w:type="dxa" w:w="6726"/>
             <w:shd w:fill="FFFFFF" w:val="clear"/>
             <w:tcMar>
               <w:top w:type="dxa" w:w="70"/>
@@ -8100,12 +8435,116 @@
             </w:tcMar>
           </w:tcPr>
           <w:p>
-            <w:r>
-              <w:rPr>
-                <w:sz w:val="21"/>
-                <w:szCs w:val="21"/>
-              </w:rPr>
-              <w:t xml:space="preserve">A reusable instruction file (SKILL.md) that teaches Claude one job.</w:t>
+            <w:pPr>
+              <w:spacing w:after="0"/>
+            </w:pPr>
+            <w:r>
+              <w:rPr>
+                <w:sz w:val="21"/>
+                <w:szCs w:val="21"/>
+              </w:rPr>
+              <w:t xml:space="preserve">A plain-text format with simple formatting. Cheap in tokens, easy for Claude to read.</w:t>
+            </w:r>
+          </w:p>
+        </w:tc>
+      </w:tr>
+    </w:tbl>
+    <w:p>
+      <w:pPr>
+        <w:spacing w:after="80" w:line="120" w:lineRule="exact"/>
+      </w:pPr>
+    </w:p>
+    <w:p>
+      <w:pPr>
+        <w:keepNext/>
+        <w:keepLines/>
+        <w:spacing w:before="160" w:after="60"/>
+      </w:pPr>
+      <w:r>
+        <w:rPr>
+          <w:b/>
+          <w:bCs/>
+          <w:color w:val="1F3A5F"/>
+          <w:sz w:val="24"/>
+          <w:szCs w:val="24"/>
+        </w:rPr>
+        <w:t xml:space="preserve">Connecting, remembering and staying safe</w:t>
+      </w:r>
+    </w:p>
+    <w:tbl>
+      <w:tblPr>
+        <w:tblW w:type="dxa" w:w="9026"/>
+        <w:tblBorders>
+          <w:top w:val="single" w:color="CCCCCC" w:sz="1"/>
+          <w:left w:val="single" w:color="CCCCCC" w:sz="1"/>
+          <w:bottom w:val="single" w:color="CCCCCC" w:sz="1"/>
+          <w:right w:val="single" w:color="CCCCCC" w:sz="1"/>
+          <w:insideH w:val="single" w:color="CCCCCC" w:sz="1"/>
+          <w:insideV w:val="single" w:color="CCCCCC" w:sz="1"/>
+        </w:tblBorders>
+      </w:tblPr>
+      <w:tblGrid>
+        <w:gridCol w:w="2300"/>
+        <w:gridCol w:w="6726"/>
+      </w:tblGrid>
+      <w:tr>
+        <w:trPr>
+          <w:cantSplit/>
+          <w:tblHeader/>
+        </w:trPr>
+        <w:tc>
+          <w:tcPr>
+            <w:tcW w:type="dxa" w:w="2300"/>
+            <w:shd w:fill="1F3A5F" w:val="clear"/>
+            <w:tcMar>
+              <w:top w:type="dxa" w:w="70"/>
+              <w:left w:type="dxa" w:w="120"/>
+              <w:bottom w:type="dxa" w:w="70"/>
+              <w:right w:type="dxa" w:w="120"/>
+            </w:tcMar>
+          </w:tcPr>
+          <w:p>
+            <w:pPr>
+              <w:keepNext/>
+              <w:spacing w:after="0"/>
+            </w:pPr>
+            <w:r>
+              <w:rPr>
+                <w:b/>
+                <w:bCs/>
+                <w:color w:val="FFFFFF"/>
+                <w:sz w:val="21"/>
+                <w:szCs w:val="21"/>
+              </w:rPr>
+              <w:t xml:space="preserve">Term</w:t>
+            </w:r>
+          </w:p>
+        </w:tc>
+        <w:tc>
+          <w:tcPr>
+            <w:tcW w:type="dxa" w:w="6726"/>
+            <w:shd w:fill="1F3A5F" w:val="clear"/>
+            <w:tcMar>
+              <w:top w:type="dxa" w:w="70"/>
+              <w:left w:type="dxa" w:w="120"/>
+              <w:bottom w:type="dxa" w:w="70"/>
+              <w:right w:type="dxa" w:w="120"/>
+            </w:tcMar>
+          </w:tcPr>
+          <w:p>
+            <w:pPr>
+              <w:keepNext/>
+              <w:spacing w:after="0"/>
+            </w:pPr>
+            <w:r>
+              <w:rPr>
+                <w:b/>
+                <w:bCs/>
+                <w:color w:val="FFFFFF"/>
+                <w:sz w:val="21"/>
+                <w:szCs w:val="21"/>
+              </w:rPr>
+              <w:t xml:space="preserve">In plain words</w:t>
             </w:r>
           </w:p>
         </w:tc>
@@ -8116,7 +8555,7 @@
         </w:trPr>
         <w:tc>
           <w:tcPr>
-            <w:tcW w:type="dxa" w:w="2600"/>
+            <w:tcW w:type="dxa" w:w="2300"/>
             <w:shd w:fill="EDF2F7" w:val="clear"/>
             <w:tcMar>
               <w:top w:type="dxa" w:w="70"/>
@@ -8126,18 +8565,21 @@
             </w:tcMar>
           </w:tcPr>
           <w:p>
-            <w:r>
-              <w:rPr>
-                <w:sz w:val="21"/>
-                <w:szCs w:val="21"/>
-              </w:rPr>
-              <w:t xml:space="preserve">Connector / MCP</w:t>
-            </w:r>
-          </w:p>
-        </w:tc>
-        <w:tc>
-          <w:tcPr>
-            <w:tcW w:type="dxa" w:w="6426"/>
+            <w:pPr>
+              <w:spacing w:after="0"/>
+            </w:pPr>
+            <w:r>
+              <w:rPr>
+                <w:sz w:val="21"/>
+                <w:szCs w:val="21"/>
+              </w:rPr>
+              <w:t xml:space="preserve">Project</w:t>
+            </w:r>
+          </w:p>
+        </w:tc>
+        <w:tc>
+          <w:tcPr>
+            <w:tcW w:type="dxa" w:w="6726"/>
             <w:shd w:fill="EDF2F7" w:val="clear"/>
             <w:tcMar>
               <w:top w:type="dxa" w:w="70"/>
@@ -8147,12 +8589,15 @@
             </w:tcMar>
           </w:tcPr>
           <w:p>
-            <w:r>
-              <w:rPr>
-                <w:sz w:val="21"/>
-                <w:szCs w:val="21"/>
-              </w:rPr>
-              <w:t xml:space="preserve">A bridge that lets Claude reach another app, like Gmail or Outlook.</w:t>
+            <w:pPr>
+              <w:spacing w:after="0"/>
+            </w:pPr>
+            <w:r>
+              <w:rPr>
+                <w:sz w:val="21"/>
+                <w:szCs w:val="21"/>
+              </w:rPr>
+              <w:t xml:space="preserve">A folder of chats sharing instructions and files.</w:t>
             </w:r>
           </w:p>
         </w:tc>
@@ -8163,7 +8608,7 @@
         </w:trPr>
         <w:tc>
           <w:tcPr>
-            <w:tcW w:type="dxa" w:w="2600"/>
+            <w:tcW w:type="dxa" w:w="2300"/>
             <w:shd w:fill="FFFFFF" w:val="clear"/>
             <w:tcMar>
               <w:top w:type="dxa" w:w="70"/>
@@ -8173,6 +8618,62 @@
             </w:tcMar>
           </w:tcPr>
           <w:p>
+            <w:pPr>
+              <w:spacing w:after="0"/>
+            </w:pPr>
+            <w:r>
+              <w:rPr>
+                <w:sz w:val="21"/>
+                <w:szCs w:val="21"/>
+              </w:rPr>
+              <w:t xml:space="preserve">Skill</w:t>
+            </w:r>
+          </w:p>
+        </w:tc>
+        <w:tc>
+          <w:tcPr>
+            <w:tcW w:type="dxa" w:w="6726"/>
+            <w:shd w:fill="FFFFFF" w:val="clear"/>
+            <w:tcMar>
+              <w:top w:type="dxa" w:w="70"/>
+              <w:left w:type="dxa" w:w="120"/>
+              <w:bottom w:type="dxa" w:w="70"/>
+              <w:right w:type="dxa" w:w="120"/>
+            </w:tcMar>
+          </w:tcPr>
+          <w:p>
+            <w:pPr>
+              <w:spacing w:after="0"/>
+            </w:pPr>
+            <w:r>
+              <w:rPr>
+                <w:sz w:val="21"/>
+                <w:szCs w:val="21"/>
+              </w:rPr>
+              <w:t xml:space="preserve">A reusable instruction file (SKILL.md) that teaches Claude one job.</w:t>
+            </w:r>
+          </w:p>
+        </w:tc>
+      </w:tr>
+      <w:tr>
+        <w:trPr>
+          <w:cantSplit/>
+        </w:trPr>
+        <w:tc>
+          <w:tcPr>
+            <w:tcW w:type="dxa" w:w="2300"/>
+            <w:shd w:fill="EDF2F7" w:val="clear"/>
+            <w:tcMar>
+              <w:top w:type="dxa" w:w="70"/>
+              <w:left w:type="dxa" w:w="120"/>
+              <w:bottom w:type="dxa" w:w="70"/>
+              <w:right w:type="dxa" w:w="120"/>
+            </w:tcMar>
+          </w:tcPr>
+          <w:p>
+            <w:pPr>
+              <w:spacing w:after="0"/>
+            </w:pPr>
             <w:r>
               <w:rPr>
                 <w:sz w:val="21"/>
@@ -8184,7 +8685,36 @@
         </w:tc>
         <w:tc>
           <w:tcPr>
-            <w:tcW w:type="dxa" w:w="6426"/>
+            <w:tcW w:type="dxa" w:w="6726"/>
+            <w:shd w:fill="EDF2F7" w:val="clear"/>
+            <w:tcMar>
+              <w:top w:type="dxa" w:w="70"/>
+              <w:left w:type="dxa" w:w="120"/>
+              <w:bottom w:type="dxa" w:w="70"/>
+              <w:right w:type="dxa" w:w="120"/>
+            </w:tcMar>
+          </w:tcPr>
+          <w:p>
+            <w:pPr>
+              <w:spacing w:after="0"/>
+            </w:pPr>
+            <w:r>
+              <w:rPr>
+                <w:sz w:val="21"/>
+                <w:szCs w:val="21"/>
+              </w:rPr>
+              <w:t xml:space="preserve">Facts Claude keeps between sessions so it remembers your setup.</w:t>
+            </w:r>
+          </w:p>
+        </w:tc>
+      </w:tr>
+      <w:tr>
+        <w:trPr>
+          <w:cantSplit/>
+        </w:trPr>
+        <w:tc>
+          <w:tcPr>
+            <w:tcW w:type="dxa" w:w="2300"/>
             <w:shd w:fill="FFFFFF" w:val="clear"/>
             <w:tcMar>
               <w:top w:type="dxa" w:w="70"/>
@@ -8194,17 +8724,367 @@
             </w:tcMar>
           </w:tcPr>
           <w:p>
-            <w:r>
-              <w:rPr>
-                <w:sz w:val="21"/>
-                <w:szCs w:val="21"/>
-              </w:rPr>
-              <w:t xml:space="preserve">Facts Claude keeps between sessions so it remembers your setup.</w:t>
+            <w:pPr>
+              <w:spacing w:after="0"/>
+            </w:pPr>
+            <w:r>
+              <w:rPr>
+                <w:sz w:val="21"/>
+                <w:szCs w:val="21"/>
+              </w:rPr>
+              <w:t xml:space="preserve">Connector</w:t>
+            </w:r>
+          </w:p>
+        </w:tc>
+        <w:tc>
+          <w:tcPr>
+            <w:tcW w:type="dxa" w:w="6726"/>
+            <w:shd w:fill="FFFFFF" w:val="clear"/>
+            <w:tcMar>
+              <w:top w:type="dxa" w:w="70"/>
+              <w:left w:type="dxa" w:w="120"/>
+              <w:bottom w:type="dxa" w:w="70"/>
+              <w:right w:type="dxa" w:w="120"/>
+            </w:tcMar>
+          </w:tcPr>
+          <w:p>
+            <w:pPr>
+              <w:spacing w:after="0"/>
+            </w:pPr>
+            <w:r>
+              <w:rPr>
+                <w:sz w:val="21"/>
+                <w:szCs w:val="21"/>
+              </w:rPr>
+              <w:t xml:space="preserve">A bridge that lets Claude reach another app, like Gmail or Outlook.</w:t>
+            </w:r>
+          </w:p>
+        </w:tc>
+      </w:tr>
+      <w:tr>
+        <w:trPr>
+          <w:cantSplit/>
+        </w:trPr>
+        <w:tc>
+          <w:tcPr>
+            <w:tcW w:type="dxa" w:w="2300"/>
+            <w:shd w:fill="EDF2F7" w:val="clear"/>
+            <w:tcMar>
+              <w:top w:type="dxa" w:w="70"/>
+              <w:left w:type="dxa" w:w="120"/>
+              <w:bottom w:type="dxa" w:w="70"/>
+              <w:right w:type="dxa" w:w="120"/>
+            </w:tcMar>
+          </w:tcPr>
+          <w:p>
+            <w:pPr>
+              <w:spacing w:after="0"/>
+            </w:pPr>
+            <w:r>
+              <w:rPr>
+                <w:sz w:val="21"/>
+                <w:szCs w:val="21"/>
+              </w:rPr>
+              <w:t xml:space="preserve">MCP</w:t>
+            </w:r>
+          </w:p>
+        </w:tc>
+        <w:tc>
+          <w:tcPr>
+            <w:tcW w:type="dxa" w:w="6726"/>
+            <w:shd w:fill="EDF2F7" w:val="clear"/>
+            <w:tcMar>
+              <w:top w:type="dxa" w:w="70"/>
+              <w:left w:type="dxa" w:w="120"/>
+              <w:bottom w:type="dxa" w:w="70"/>
+              <w:right w:type="dxa" w:w="120"/>
+            </w:tcMar>
+          </w:tcPr>
+          <w:p>
+            <w:pPr>
+              <w:spacing w:after="0"/>
+            </w:pPr>
+            <w:r>
+              <w:rPr>
+                <w:sz w:val="21"/>
+                <w:szCs w:val="21"/>
+              </w:rPr>
+              <w:t xml:space="preserve">The shared standard that connectors use to talk to Claude.</w:t>
+            </w:r>
+          </w:p>
+        </w:tc>
+      </w:tr>
+      <w:tr>
+        <w:trPr>
+          <w:cantSplit/>
+        </w:trPr>
+        <w:tc>
+          <w:tcPr>
+            <w:tcW w:type="dxa" w:w="2300"/>
+            <w:shd w:fill="FFFFFF" w:val="clear"/>
+            <w:tcMar>
+              <w:top w:type="dxa" w:w="70"/>
+              <w:left w:type="dxa" w:w="120"/>
+              <w:bottom w:type="dxa" w:w="70"/>
+              <w:right w:type="dxa" w:w="120"/>
+            </w:tcMar>
+          </w:tcPr>
+          <w:p>
+            <w:pPr>
+              <w:spacing w:after="0"/>
+            </w:pPr>
+            <w:r>
+              <w:rPr>
+                <w:sz w:val="21"/>
+                <w:szCs w:val="21"/>
+              </w:rPr>
+              <w:t xml:space="preserve">Dispatch</w:t>
+            </w:r>
+          </w:p>
+        </w:tc>
+        <w:tc>
+          <w:tcPr>
+            <w:tcW w:type="dxa" w:w="6726"/>
+            <w:shd w:fill="FFFFFF" w:val="clear"/>
+            <w:tcMar>
+              <w:top w:type="dxa" w:w="70"/>
+              <w:left w:type="dxa" w:w="120"/>
+              <w:bottom w:type="dxa" w:w="70"/>
+              <w:right w:type="dxa" w:w="120"/>
+            </w:tcMar>
+          </w:tcPr>
+          <w:p>
+            <w:pPr>
+              <w:spacing w:after="0"/>
+            </w:pPr>
+            <w:r>
+              <w:rPr>
+                <w:sz w:val="21"/>
+                <w:szCs w:val="21"/>
+              </w:rPr>
+              <w:t xml:space="preserve">Starting a Cowork task from your phone; the desktop does the work.</w:t>
+            </w:r>
+          </w:p>
+        </w:tc>
+      </w:tr>
+      <w:tr>
+        <w:trPr>
+          <w:cantSplit/>
+        </w:trPr>
+        <w:tc>
+          <w:tcPr>
+            <w:tcW w:type="dxa" w:w="2300"/>
+            <w:shd w:fill="EDF2F7" w:val="clear"/>
+            <w:tcMar>
+              <w:top w:type="dxa" w:w="70"/>
+              <w:left w:type="dxa" w:w="120"/>
+              <w:bottom w:type="dxa" w:w="70"/>
+              <w:right w:type="dxa" w:w="120"/>
+            </w:tcMar>
+          </w:tcPr>
+          <w:p>
+            <w:pPr>
+              <w:spacing w:after="0"/>
+            </w:pPr>
+            <w:r>
+              <w:rPr>
+                <w:sz w:val="21"/>
+                <w:szCs w:val="21"/>
+              </w:rPr>
+              <w:t xml:space="preserve">Code</w:t>
+            </w:r>
+          </w:p>
+        </w:tc>
+        <w:tc>
+          <w:tcPr>
+            <w:tcW w:type="dxa" w:w="6726"/>
+            <w:shd w:fill="EDF2F7" w:val="clear"/>
+            <w:tcMar>
+              <w:top w:type="dxa" w:w="70"/>
+              <w:left w:type="dxa" w:w="120"/>
+              <w:bottom w:type="dxa" w:w="70"/>
+              <w:right w:type="dxa" w:w="120"/>
+            </w:tcMar>
+          </w:tcPr>
+          <w:p>
+            <w:pPr>
+              <w:spacing w:after="0"/>
+            </w:pPr>
+            <w:r>
+              <w:rPr>
+                <w:sz w:val="21"/>
+                <w:szCs w:val="21"/>
+              </w:rPr>
+              <w:t xml:space="preserve">Claude that writes and runs real software.</w:t>
+            </w:r>
+          </w:p>
+        </w:tc>
+      </w:tr>
+      <w:tr>
+        <w:trPr>
+          <w:cantSplit/>
+        </w:trPr>
+        <w:tc>
+          <w:tcPr>
+            <w:tcW w:type="dxa" w:w="2300"/>
+            <w:shd w:fill="FFFFFF" w:val="clear"/>
+            <w:tcMar>
+              <w:top w:type="dxa" w:w="70"/>
+              <w:left w:type="dxa" w:w="120"/>
+              <w:bottom w:type="dxa" w:w="70"/>
+              <w:right w:type="dxa" w:w="120"/>
+            </w:tcMar>
+          </w:tcPr>
+          <w:p>
+            <w:pPr>
+              <w:spacing w:after="0"/>
+            </w:pPr>
+            <w:r>
+              <w:rPr>
+                <w:sz w:val="21"/>
+                <w:szCs w:val="21"/>
+              </w:rPr>
+              <w:t xml:space="preserve">API key</w:t>
+            </w:r>
+          </w:p>
+        </w:tc>
+        <w:tc>
+          <w:tcPr>
+            <w:tcW w:type="dxa" w:w="6726"/>
+            <w:shd w:fill="FFFFFF" w:val="clear"/>
+            <w:tcMar>
+              <w:top w:type="dxa" w:w="70"/>
+              <w:left w:type="dxa" w:w="120"/>
+              <w:bottom w:type="dxa" w:w="70"/>
+              <w:right w:type="dxa" w:w="120"/>
+            </w:tcMar>
+          </w:tcPr>
+          <w:p>
+            <w:pPr>
+              <w:spacing w:after="0"/>
+            </w:pPr>
+            <w:r>
+              <w:rPr>
+                <w:sz w:val="21"/>
+                <w:szCs w:val="21"/>
+              </w:rPr>
+              <w:t xml:space="preserve">A secret code that lets a program use a service. Never paste it in a chat.</w:t>
+            </w:r>
+          </w:p>
+        </w:tc>
+      </w:tr>
+      <w:tr>
+        <w:trPr>
+          <w:cantSplit/>
+        </w:trPr>
+        <w:tc>
+          <w:tcPr>
+            <w:tcW w:type="dxa" w:w="2300"/>
+            <w:shd w:fill="EDF2F7" w:val="clear"/>
+            <w:tcMar>
+              <w:top w:type="dxa" w:w="70"/>
+              <w:left w:type="dxa" w:w="120"/>
+              <w:bottom w:type="dxa" w:w="70"/>
+              <w:right w:type="dxa" w:w="120"/>
+            </w:tcMar>
+          </w:tcPr>
+          <w:p>
+            <w:pPr>
+              <w:spacing w:after="0"/>
+            </w:pPr>
+            <w:r>
+              <w:rPr>
+                <w:sz w:val="21"/>
+                <w:szCs w:val="21"/>
+              </w:rPr>
+              <w:t xml:space="preserve">Skip permissions</w:t>
+            </w:r>
+          </w:p>
+        </w:tc>
+        <w:tc>
+          <w:tcPr>
+            <w:tcW w:type="dxa" w:w="6726"/>
+            <w:shd w:fill="EDF2F7" w:val="clear"/>
+            <w:tcMar>
+              <w:top w:type="dxa" w:w="70"/>
+              <w:left w:type="dxa" w:w="120"/>
+              <w:bottom w:type="dxa" w:w="70"/>
+              <w:right w:type="dxa" w:w="120"/>
+            </w:tcMar>
+          </w:tcPr>
+          <w:p>
+            <w:pPr>
+              <w:spacing w:after="0"/>
+            </w:pPr>
+            <w:r>
+              <w:rPr>
+                <w:sz w:val="21"/>
+                <w:szCs w:val="21"/>
+              </w:rPr>
+              <w:t xml:space="preserve">A mode where Claude acts without asking first. Use it only on files you can replace.</w:t>
+            </w:r>
+          </w:p>
+        </w:tc>
+      </w:tr>
+      <w:tr>
+        <w:trPr>
+          <w:cantSplit/>
+        </w:trPr>
+        <w:tc>
+          <w:tcPr>
+            <w:tcW w:type="dxa" w:w="2300"/>
+            <w:shd w:fill="FFFFFF" w:val="clear"/>
+            <w:tcMar>
+              <w:top w:type="dxa" w:w="70"/>
+              <w:left w:type="dxa" w:w="120"/>
+              <w:bottom w:type="dxa" w:w="70"/>
+              <w:right w:type="dxa" w:w="120"/>
+            </w:tcMar>
+          </w:tcPr>
+          <w:p>
+            <w:pPr>
+              <w:spacing w:after="0"/>
+            </w:pPr>
+            <w:r>
+              <w:rPr>
+                <w:sz w:val="21"/>
+                <w:szCs w:val="21"/>
+              </w:rPr>
+              <w:t xml:space="preserve">Computer use</w:t>
+            </w:r>
+          </w:p>
+        </w:tc>
+        <w:tc>
+          <w:tcPr>
+            <w:tcW w:type="dxa" w:w="6726"/>
+            <w:shd w:fill="FFFFFF" w:val="clear"/>
+            <w:tcMar>
+              <w:top w:type="dxa" w:w="70"/>
+              <w:left w:type="dxa" w:w="120"/>
+              <w:bottom w:type="dxa" w:w="70"/>
+              <w:right w:type="dxa" w:w="120"/>
+            </w:tcMar>
+          </w:tcPr>
+          <w:p>
+            <w:pPr>
+              <w:spacing w:after="0"/>
+            </w:pPr>
+            <w:r>
+              <w:rPr>
+                <w:sz w:val="21"/>
+                <w:szCs w:val="21"/>
+              </w:rPr>
+              <w:t xml:space="preserve">Claude moving your mouse and typing on your screen. Give it the least access you can.</w:t>
             </w:r>
           </w:p>
         </w:tc>
       </w:tr>
     </w:tbl>
+    <w:p>
+      <w:pPr>
+        <w:spacing w:after="80" w:line="120" w:lineRule="exact"/>
+      </w:pPr>
+    </w:p>
     <w:p>
       <w:pPr>
         <w:pStyle w:val="Heading1"/>
@@ -8333,7 +9213,7 @@
               <w:spacing w:after="100" w:line="262"/>
             </w:pPr>
             <w:r>
-              <w:t xml:space="preserve">Several name older models ("Opus 4.7") and quote out-of-date numbers. The current models are Opus 4.8, Sonnet 4.6, Haiku 4.5 — trust this manual over a video's version numbers.</w:t>
+              <w:t xml:space="preserve">Several name older models and quote out-of-date numbers. For model names, trust the model picker in the app over any video or book.</w:t>
             </w:r>
           </w:p>
         </w:tc>

</xml_diff>